<commit_message>
Add mission-field request examples to slide command reference
Co-Authored-By: Claude Opus 5.5 <noreply@anthropic.com>
Claude-Session: https://claude.ai/code/session_01PZhUr8CKi4vCvDDm3qMvN7
</commit_message>
<xml_diff>
--- a/HTML_슬라이드_효과_명령어.docx
+++ b/HTML_슬라이드_효과_명령어.docx
@@ -1280,7 +1280,248 @@
           <w:sz w:val="30"/>
           <w:szCs w:val="30"/>
         </w:rPr>
-        <w:t xml:space="preserve">7. 팁</w:t>
+        <w:t xml:space="preserve">7. 선교 현장 요청 예시</w:t>
+      </w:r>
+    </w:p>
+    <w:p>
+      <w:pPr>
+        <w:spacing w:after="120"/>
+        <w:rPr>
+          <w:b/>
+          <w:bCs/>
+        </w:rPr>
+      </w:pPr>
+      <w:r>
+        <w:rPr>
+          <w:rFonts w:ascii="Malgun Gothic" w:cs="Malgun Gothic" w:eastAsia="Malgun Gothic" w:hAnsi="Malgun Gothic"/>
+          <w:b/>
+          <w:bCs/>
+          <w:sz w:val="22"/>
+          <w:szCs w:val="22"/>
+        </w:rPr>
+        <w:t xml:space="preserve">1. 노방전도용 (짧고 쉽게)</w:t>
+      </w:r>
+    </w:p>
+    <w:p>
+      <w:pPr>
+        <w:pBdr>
+          <w:left w:val="single" w:color="2E5A88" w:sz="18" w:space="8"/>
+        </w:pBdr>
+        <w:shd w:fill="EEF3F8" w:color="auto" w:val="clear"/>
+        <w:spacing w:after="160" w:before="80"/>
+        <w:ind w:left="360" w:right="360"/>
+      </w:pPr>
+      <w:r>
+        <w:rPr>
+          <w:rFonts w:ascii="Malgun Gothic" w:cs="Malgun Gothic" w:eastAsia="Malgun Gothic" w:hAnsi="Malgun Gothic"/>
+          <w:sz w:val="22"/>
+          <w:szCs w:val="22"/>
+        </w:rPr>
+        <w:t xml:space="preserve">캄보디아 동네 초신자에게 보여줄 복음 전도 HTML 슬라이드 5장 만들어줘. 크메르어와 한국어를 같이 쓰고, 각 장에 맞는 이미지는 AI로 생성해서 넣어줘. 제목은 페이드 인, 핵심 단어는 형광펜 강조. 휴대폰으로 보여줄 거니까 화면 터치로 넘기게 하고 웹 링크로 줘.</w:t>
+      </w:r>
+    </w:p>
+    <w:p>
+      <w:pPr>
+        <w:spacing w:after="120"/>
+        <w:rPr>
+          <w:b/>
+          <w:bCs/>
+        </w:rPr>
+      </w:pPr>
+      <w:r>
+        <w:rPr>
+          <w:rFonts w:ascii="Malgun Gothic" w:cs="Malgun Gothic" w:eastAsia="Malgun Gothic" w:hAnsi="Malgun Gothic"/>
+          <w:b/>
+          <w:bCs/>
+          <w:sz w:val="22"/>
+          <w:szCs w:val="22"/>
+        </w:rPr>
+        <w:t xml:space="preserve">2. 어린이 사역용 (밝고 재미있게)</w:t>
+      </w:r>
+    </w:p>
+    <w:p>
+      <w:pPr>
+        <w:pBdr>
+          <w:left w:val="single" w:color="2E5A88" w:sz="18" w:space="8"/>
+        </w:pBdr>
+        <w:shd w:fill="EEF3F8" w:color="auto" w:val="clear"/>
+        <w:spacing w:after="160" w:before="80"/>
+        <w:ind w:left="360" w:right="360"/>
+      </w:pPr>
+      <w:r>
+        <w:rPr>
+          <w:rFonts w:ascii="Malgun Gothic" w:cs="Malgun Gothic" w:eastAsia="Malgun Gothic" w:hAnsi="Malgun Gothic"/>
+          <w:sz w:val="22"/>
+          <w:szCs w:val="22"/>
+        </w:rPr>
+        <w:t xml:space="preserve">캄보디아 어린이 대상 성경 이야기 HTML 슬라이드 5장 만들어줘. 주제는 다윗과 골리앗. 이미지는 밝은 색 만화풍 일러스트로 넣고, 제목은 튀어오름 효과, 본문은 한 줄씩 순서대로 등장. 글자는 크게 해줘.</w:t>
+      </w:r>
+    </w:p>
+    <w:p>
+      <w:pPr>
+        <w:spacing w:after="120"/>
+        <w:rPr>
+          <w:b/>
+          <w:bCs/>
+        </w:rPr>
+      </w:pPr>
+      <w:r>
+        <w:rPr>
+          <w:rFonts w:ascii="Malgun Gothic" w:cs="Malgun Gothic" w:eastAsia="Malgun Gothic" w:hAnsi="Malgun Gothic"/>
+          <w:b/>
+          <w:bCs/>
+          <w:sz w:val="22"/>
+          <w:szCs w:val="22"/>
+        </w:rPr>
+        <w:t xml:space="preserve">3. 선교 보고용 (후원 교회에 발표)</w:t>
+      </w:r>
+    </w:p>
+    <w:p>
+      <w:pPr>
+        <w:pBdr>
+          <w:left w:val="single" w:color="2E5A88" w:sz="18" w:space="8"/>
+        </w:pBdr>
+        <w:shd w:fill="EEF3F8" w:color="auto" w:val="clear"/>
+        <w:spacing w:after="160" w:before="80"/>
+        <w:ind w:left="360" w:right="360"/>
+      </w:pPr>
+      <w:r>
+        <w:rPr>
+          <w:rFonts w:ascii="Malgun Gothic" w:cs="Malgun Gothic" w:eastAsia="Malgun Gothic" w:hAnsi="Malgun Gothic"/>
+          <w:sz w:val="22"/>
+          <w:szCs w:val="22"/>
+        </w:rPr>
+        <w:t xml:space="preserve">캄보디아 선교 보고 HTML 슬라이드 5장 만들어줘. 순서는 사역지 소개, 올해 사역 내용, 감사 제목, 기도 제목, 후원 감사 인사. 사진은 내가 올리는 사진으로 넣고, 이미지는 천천히 확대되는 효과, 전환은 페이드로 해줘.</w:t>
+      </w:r>
+    </w:p>
+    <w:p>
+      <w:pPr>
+        <w:spacing w:after="120"/>
+        <w:rPr>
+          <w:b/>
+          <w:bCs/>
+        </w:rPr>
+      </w:pPr>
+      <w:r>
+        <w:rPr>
+          <w:rFonts w:ascii="Malgun Gothic" w:cs="Malgun Gothic" w:eastAsia="Malgun Gothic" w:hAnsi="Malgun Gothic"/>
+          <w:b/>
+          <w:bCs/>
+          <w:sz w:val="22"/>
+          <w:szCs w:val="22"/>
+        </w:rPr>
+        <w:t xml:space="preserve">4. 현지 예배·모임용 (찬양과 말씀)</w:t>
+      </w:r>
+    </w:p>
+    <w:p>
+      <w:pPr>
+        <w:pBdr>
+          <w:left w:val="single" w:color="2E5A88" w:sz="18" w:space="8"/>
+        </w:pBdr>
+        <w:shd w:fill="EEF3F8" w:color="auto" w:val="clear"/>
+        <w:spacing w:after="160" w:before="80"/>
+        <w:ind w:left="360" w:right="360"/>
+      </w:pPr>
+      <w:r>
+        <w:rPr>
+          <w:rFonts w:ascii="Malgun Gothic" w:cs="Malgun Gothic" w:eastAsia="Malgun Gothic" w:hAnsi="Malgun Gothic"/>
+          <w:sz w:val="22"/>
+          <w:szCs w:val="22"/>
+        </w:rPr>
+        <w:t xml:space="preserve">캄보디아 현지 교회 주일 모임용 HTML 슬라이드 5장 만들어줘. 본문은 요한복음 3장 16절, 초신자도 이해하기 쉽게 풀어줘. 크메르어 위주로 쓰고, 각 장에 맞는 이미지는 AI로 생성. 말씀 구절은 타자기 효과로 해줘.</w:t>
+      </w:r>
+    </w:p>
+    <w:p>
+      <w:pPr>
+        <w:spacing w:after="120"/>
+        <w:rPr>
+          <w:b/>
+          <w:bCs/>
+        </w:rPr>
+      </w:pPr>
+      <w:r>
+        <w:rPr>
+          <w:rFonts w:ascii="Malgun Gothic" w:cs="Malgun Gothic" w:eastAsia="Malgun Gothic" w:hAnsi="Malgun Gothic"/>
+          <w:b/>
+          <w:bCs/>
+          <w:sz w:val="22"/>
+          <w:szCs w:val="22"/>
+        </w:rPr>
+        <w:t xml:space="preserve">5. 마을 행사·자동 재생용 (화면에 틀어놓기)</w:t>
+      </w:r>
+    </w:p>
+    <w:p>
+      <w:pPr>
+        <w:pBdr>
+          <w:left w:val="single" w:color="2E5A88" w:sz="18" w:space="8"/>
+        </w:pBdr>
+        <w:shd w:fill="EEF3F8" w:color="auto" w:val="clear"/>
+        <w:spacing w:after="160" w:before="80"/>
+        <w:ind w:left="360" w:right="360"/>
+      </w:pPr>
+      <w:r>
+        <w:rPr>
+          <w:rFonts w:ascii="Malgun Gothic" w:cs="Malgun Gothic" w:eastAsia="Malgun Gothic" w:hAnsi="Malgun Gothic"/>
+          <w:sz w:val="22"/>
+          <w:szCs w:val="22"/>
+        </w:rPr>
+        <w:t xml:space="preserve">캄보디아 마을 의료·나눔 행사에서 화면에 틀어둘 HTML 슬라이드 5장 만들어줘. 주제는 하나님의 사랑과 교회 소개. 이미지는 따뜻한 느낌의 실사 스타일로 AI 생성, 5초마다 자동으로 넘어가고 끝나면 처음부터 다시 반복되게 해줘.</w:t>
+      </w:r>
+    </w:p>
+    <w:p>
+      <w:pPr>
+        <w:pStyle w:val="ListParagraph"/>
+        <w:numPr>
+          <w:ilvl w:val="0"/>
+          <w:numId w:val="2"/>
+        </w:numPr>
+        <w:spacing w:after="80"/>
+      </w:pPr>
+      <w:r>
+        <w:rPr>
+          <w:rFonts w:ascii="Malgun Gothic" w:cs="Malgun Gothic" w:eastAsia="Malgun Gothic" w:hAnsi="Malgun Gothic"/>
+          <w:sz w:val="22"/>
+          <w:szCs w:val="22"/>
+        </w:rPr>
+        <w:t xml:space="preserve">현지 언어가 필요하면 "크메르어와 한국어 같이"처럼 꼭 적기</w:t>
+      </w:r>
+    </w:p>
+    <w:p>
+      <w:pPr>
+        <w:pStyle w:val="ListParagraph"/>
+        <w:numPr>
+          <w:ilvl w:val="0"/>
+          <w:numId w:val="2"/>
+        </w:numPr>
+        <w:spacing w:after="80"/>
+      </w:pPr>
+      <w:r>
+        <w:rPr>
+          <w:rFonts w:ascii="Malgun Gothic" w:cs="Malgun Gothic" w:eastAsia="Malgun Gothic" w:hAnsi="Malgun Gothic"/>
+          <w:sz w:val="22"/>
+          <w:szCs w:val="22"/>
+        </w:rPr>
+        <w:t xml:space="preserve">휴대폰으로 보여줄 때는 "글자 크게, 터치로 넘기기" 넣기</w:t>
+      </w:r>
+    </w:p>
+    <w:p>
+      <w:pPr>
+        <w:pStyle w:val="Heading1"/>
+        <w:pBdr>
+          <w:bottom w:val="single" w:color="2E5A88" w:sz="6" w:space="4"/>
+        </w:pBdr>
+        <w:spacing w:after="160" w:before="360"/>
+      </w:pPr>
+      <w:r>
+        <w:rPr>
+          <w:rFonts w:ascii="Malgun Gothic" w:cs="Malgun Gothic" w:eastAsia="Malgun Gothic" w:hAnsi="Malgun Gothic"/>
+          <w:b/>
+          <w:bCs/>
+          <w:color w:val="2E5A88"/>
+          <w:sz w:val="30"/>
+          <w:szCs w:val="30"/>
+        </w:rPr>
+        <w:t xml:space="preserve">8. 팁</w:t>
       </w:r>
     </w:p>
     <w:p>

</xml_diff>